<commit_message>
feat(paper+evals): v0.3 control-pending notes; paraphrase-control prompt builder
Paper changes:
- §7.1 adds explicit "Controls not yet applied" subsection naming the
  pending paraphrase, native-language, axis-label, and higher-rep-count
  controls. Sets clear methodological expectations for v0.4+.
- Frontmatter target_venues field adds intended journal submission to
  Open Journal of AI Ethics and Society (or similar AI-ethics open-access
  venue, TBC).
- Date stays 2026-04-29.

Code changes:
- evals/bias-comparator/run.py adds a paraphrase-control prompt builder
  (build_prompt_v2) with same information content as v1, different surface
  structure. CLI flag --prompt-version v1|v2 selects which scaffold runs.
- The paraphrase-control prototype run is now in flight; results will
  fold into v0.4 of the paper.
</commit_message>
<xml_diff>
--- a/papers/20260429-tribunal-position-paper-v0.3.docx
+++ b/papers/20260429-tribunal-position-paper-v0.3.docx
@@ -1622,14 +1622,16 @@
         <w:t xml:space="preserve">include the full curated evidence corpus — models scored from training-data knowledge of the figures, with cited sources evaluated post-hoc. This is a methodological limitation noted in §10.</w:t>
       </w:r>
     </w:p>
-    <w:bookmarkEnd w:id="24"/>
-    <w:bookmarkStart w:id="25" w:name="aggregate-reliability"/>
-    <w:p>
-      <w:pPr>
-        <w:pStyle w:val="Heading3"/>
-      </w:pPr>
-      <w:r>
-        <w:t xml:space="preserve">7.2 Aggregate reliability</w:t>
+    <w:p>
+      <w:pPr>
+        <w:pStyle w:val="BodyText"/>
+      </w:pPr>
+      <w:r>
+        <w:rPr>
+          <w:b/>
+          <w:bCs/>
+        </w:rPr>
+        <w:t xml:space="preserve">Controls not yet applied in v0.3 (pending in subsequent versions):</w:t>
       </w:r>
     </w:p>
     <w:p>
@@ -1645,13 +1647,13 @@
           <w:b/>
           <w:bCs/>
         </w:rPr>
-        <w:t xml:space="preserve">205 / 216 strict success</w:t>
-      </w:r>
-      <w:r>
-        <w:t xml:space="preserve"> </w:t>
-      </w:r>
-      <w:r>
-        <w:t xml:space="preserve">(94.9%)</w:t>
+        <w:t xml:space="preserve">Prompt paraphrase control.</w:t>
+      </w:r>
+      <w:r>
+        <w:t xml:space="preserve"> </w:t>
+      </w:r>
+      <w:r>
+        <w:t xml:space="preserve">All 216 cells use a single prompt phrasing. v0.4 will re-run the matrix against one or more paraphrased prompt variants and report score-stability. If scores shift meaningfully under paraphrase, the surface form is anchoring more than the substance and the methodology requires a stability margin in §3.</w:t>
       </w:r>
     </w:p>
     <w:p>
@@ -1667,13 +1669,13 @@
           <w:b/>
           <w:bCs/>
         </w:rPr>
-        <w:t xml:space="preserve">4 additional records recovered</w:t>
-      </w:r>
-      <w:r>
-        <w:t xml:space="preserve"> </w:t>
-      </w:r>
-      <w:r>
-        <w:t xml:space="preserve">by a permissive parser (small JSON-formatting bugs in model output, score still cleanly extractable)</w:t>
+        <w:t xml:space="preserve">Native-language locale runs.</w:t>
+      </w:r>
+      <w:r>
+        <w:t xml:space="preserve"> </w:t>
+      </w:r>
+      <w:r>
+        <w:t xml:space="preserve">All cells were scored in English. Robespierre (French primary scholarship) is the cleanest test case; v0.4 or v0.5 will run a non-English variant and compare. The position paper §3.2 anticipates this as a Phase 2 analysis but a v0.4 mini-extension is feasible.</w:t>
       </w:r>
     </w:p>
     <w:p>
@@ -1689,13 +1691,40 @@
           <w:b/>
           <w:bCs/>
         </w:rPr>
-        <w:t xml:space="preserve">7 unrecovered failures</w:t>
-      </w:r>
-      <w:r>
-        <w:t xml:space="preserve"> </w:t>
-      </w:r>
-      <w:r>
-        <w:t xml:space="preserve">(3.2%) — all from Chinese reasoning models (Kimi K2.6, MiniMax M2.7, GLM 5.1) that exhausted the 8000-token budget on hidden chain-of-thought before producing the JSON answer</w:t>
+        <w:t xml:space="preserve">Axis-label sensitivity.</w:t>
+      </w:r>
+      <w:r>
+        <w:t xml:space="preserve"> </w:t>
+      </w:r>
+      <w:r>
+        <w:t xml:space="preserve">“Hypocrisy”</w:t>
+      </w:r>
+      <w:r>
+        <w:t xml:space="preserve"> </w:t>
+      </w:r>
+      <w:r>
+        <w:t xml:space="preserve">might anchor differently from</w:t>
+      </w:r>
+      <w:r>
+        <w:t xml:space="preserve"> </w:t>
+      </w:r>
+      <w:r>
+        <w:t xml:space="preserve">“duplicity”</w:t>
+      </w:r>
+      <w:r>
+        <w:t xml:space="preserve"> </w:t>
+      </w:r>
+      <w:r>
+        <w:t xml:space="preserve">or</w:t>
+      </w:r>
+      <w:r>
+        <w:t xml:space="preserve"> </w:t>
+      </w:r>
+      <w:r>
+        <w:t xml:space="preserve">“two-faced behavior”</w:t>
+      </w:r>
+      <w:r>
+        <w:t xml:space="preserve">. A single-axis paraphrase test on one figure across the panel would surface whether locked-axis labels are doing more than the operationalization.</w:t>
       </w:r>
     </w:p>
     <w:p>
@@ -1704,6 +1733,112 @@
         <w:numPr>
           <w:ilvl w:val="0"/>
           <w:numId w:val="1004"/>
+        </w:numPr>
+      </w:pPr>
+      <w:r>
+        <w:rPr>
+          <w:b/>
+          <w:bCs/>
+        </w:rPr>
+        <w:t xml:space="preserve">Within-model consistency at higher rep counts.</w:t>
+      </w:r>
+      <w:r>
+        <w:t xml:space="preserve"> </w:t>
+      </w:r>
+      <w:r>
+        <w:t xml:space="preserve">v0.3 uses 2 reps per cell. Phase 2 scaling to 5+ reps will tighten within-model variance estimates and disambiguate noise from outlier patterns in §7.4.</w:t>
+      </w:r>
+    </w:p>
+    <w:p>
+      <w:pPr>
+        <w:pStyle w:val="FirstParagraph"/>
+      </w:pPr>
+      <w:r>
+        <w:t xml:space="preserve">These controls are open methodological loose ends acknowledged in v0.3; results from running them will be reported in subsequent versions and folded into the canonical findings.</w:t>
+      </w:r>
+    </w:p>
+    <w:bookmarkEnd w:id="24"/>
+    <w:bookmarkStart w:id="25" w:name="aggregate-reliability"/>
+    <w:p>
+      <w:pPr>
+        <w:pStyle w:val="Heading3"/>
+      </w:pPr>
+      <w:r>
+        <w:t xml:space="preserve">7.2 Aggregate reliability</w:t>
+      </w:r>
+    </w:p>
+    <w:p>
+      <w:pPr>
+        <w:pStyle w:val="Compact"/>
+        <w:numPr>
+          <w:ilvl w:val="0"/>
+          <w:numId w:val="1005"/>
+        </w:numPr>
+      </w:pPr>
+      <w:r>
+        <w:rPr>
+          <w:b/>
+          <w:bCs/>
+        </w:rPr>
+        <w:t xml:space="preserve">205 / 216 strict success</w:t>
+      </w:r>
+      <w:r>
+        <w:t xml:space="preserve"> </w:t>
+      </w:r>
+      <w:r>
+        <w:t xml:space="preserve">(94.9%)</w:t>
+      </w:r>
+    </w:p>
+    <w:p>
+      <w:pPr>
+        <w:pStyle w:val="Compact"/>
+        <w:numPr>
+          <w:ilvl w:val="0"/>
+          <w:numId w:val="1005"/>
+        </w:numPr>
+      </w:pPr>
+      <w:r>
+        <w:rPr>
+          <w:b/>
+          <w:bCs/>
+        </w:rPr>
+        <w:t xml:space="preserve">4 additional records recovered</w:t>
+      </w:r>
+      <w:r>
+        <w:t xml:space="preserve"> </w:t>
+      </w:r>
+      <w:r>
+        <w:t xml:space="preserve">by a permissive parser (small JSON-formatting bugs in model output, score still cleanly extractable)</w:t>
+      </w:r>
+    </w:p>
+    <w:p>
+      <w:pPr>
+        <w:pStyle w:val="Compact"/>
+        <w:numPr>
+          <w:ilvl w:val="0"/>
+          <w:numId w:val="1005"/>
+        </w:numPr>
+      </w:pPr>
+      <w:r>
+        <w:rPr>
+          <w:b/>
+          <w:bCs/>
+        </w:rPr>
+        <w:t xml:space="preserve">7 unrecovered failures</w:t>
+      </w:r>
+      <w:r>
+        <w:t xml:space="preserve"> </w:t>
+      </w:r>
+      <w:r>
+        <w:t xml:space="preserve">(3.2%) — all from Chinese reasoning models (Kimi K2.6, MiniMax M2.7, GLM 5.1) that exhausted the 8000-token budget on hidden chain-of-thought before producing the JSON answer</w:t>
+      </w:r>
+    </w:p>
+    <w:p>
+      <w:pPr>
+        <w:pStyle w:val="Compact"/>
+        <w:numPr>
+          <w:ilvl w:val="0"/>
+          <w:numId w:val="1005"/>
         </w:numPr>
       </w:pPr>
       <w:r>
@@ -2661,7 +2796,7 @@
         <w:pStyle w:val="Compact"/>
         <w:numPr>
           <w:ilvl w:val="0"/>
-          <w:numId w:val="1005"/>
+          <w:numId w:val="1006"/>
         </w:numPr>
       </w:pPr>
       <w:r>
@@ -2676,90 +2811,6 @@
       </w:r>
       <w:r>
         <w:t xml:space="preserve">Both Robespierre (range = 5.0) and Lincoln (range = 4.0) on opportunism produce the widest spreads in the matrix. Robespierre’s opportunism scores span 2 to 7; Lincoln’s span 3 to 7. By contrast, hypocrisy/honor/integrity scores cluster within 1–2 points across the panel for most figures.</w:t>
-      </w:r>
-    </w:p>
-    <w:p>
-      <w:pPr>
-        <w:pStyle w:val="Compact"/>
-        <w:numPr>
-          <w:ilvl w:val="0"/>
-          <w:numId w:val="1005"/>
-        </w:numPr>
-      </w:pPr>
-      <w:r>
-        <w:rPr>
-          <w:b/>
-          <w:bCs/>
-        </w:rPr>
-        <w:t xml:space="preserve">Hypocrisy is the most consensual axis.</w:t>
-      </w:r>
-      <w:r>
-        <w:t xml:space="preserve"> </w:t>
-      </w:r>
-      <w:r>
-        <w:t xml:space="preserve">All three figures’ hypocrisy scores have ≤1 point inter-model range. Models substantively agree that Cromwell (mean 7.33), Robespierre (mean 8.44), and Lincoln (mean 4.0) sit roughly where mainstream historical scholarship places them.</w:t>
-      </w:r>
-    </w:p>
-    <w:p>
-      <w:pPr>
-        <w:pStyle w:val="Compact"/>
-        <w:numPr>
-          <w:ilvl w:val="0"/>
-          <w:numId w:val="1005"/>
-        </w:numPr>
-      </w:pPr>
-      <w:r>
-        <w:rPr>
-          <w:b/>
-          <w:bCs/>
-        </w:rPr>
-        <w:t xml:space="preserve">Lincoln’s honor and integrity are essentially uncontested</w:t>
-      </w:r>
-      <w:r>
-        <w:t xml:space="preserve"> </w:t>
-      </w:r>
-      <w:r>
-        <w:t xml:space="preserve">(means 8.28 and 8.33, both with range 1.0). The Second-Inaugural-Address-anchored read of Lincoln’s character is robust across all nine frontier models.</w:t>
-      </w:r>
-    </w:p>
-    <w:p>
-      <w:pPr>
-        <w:pStyle w:val="Compact"/>
-        <w:numPr>
-          <w:ilvl w:val="0"/>
-          <w:numId w:val="1005"/>
-        </w:numPr>
-      </w:pPr>
-      <w:r>
-        <w:rPr>
-          <w:b/>
-          <w:bCs/>
-        </w:rPr>
-        <w:t xml:space="preserve">Robespierre’s honor is the lowest-scoring cell in the matrix</w:t>
-      </w:r>
-      <w:r>
-        <w:t xml:space="preserve"> </w:t>
-      </w:r>
-      <w:r>
-        <w:t xml:space="preserve">(mean 2.56), again with tight cross-model agreement (range 2.0). Models substantively converge on the Reign of Terror as the dominant evidence for the honor axis.</w:t>
-      </w:r>
-    </w:p>
-    <w:bookmarkEnd w:id="26"/>
-    <w:bookmarkStart w:id="27" w:name="X624ff9d1ab65db281075101918a1d7cae281194"/>
-    <w:p>
-      <w:pPr>
-        <w:pStyle w:val="Heading3"/>
-      </w:pPr>
-      <w:r>
-        <w:t xml:space="preserve">7.4 Per-model patterns (preliminary, n=3 figures)</w:t>
-      </w:r>
-    </w:p>
-    <w:p>
-      <w:pPr>
-        <w:pStyle w:val="FirstParagraph"/>
-      </w:pPr>
-      <w:r>
-        <w:t xml:space="preserve">Two models produce notable outlier patterns at this small scale:</w:t>
       </w:r>
     </w:p>
     <w:p>
@@ -2775,13 +2826,13 @@
           <w:b/>
           <w:bCs/>
         </w:rPr>
-        <w:t xml:space="preserve">MiniMax M2.7</w:t>
-      </w:r>
-      <w:r>
-        <w:t xml:space="preserve"> </w:t>
-      </w:r>
-      <w:r>
-        <w:t xml:space="preserve">scores Cromwell on integrity at 4.5 (vs. panel median ≈ 7) and Robespierre on opportunism at 7 (vs. panel median ≈ 4). Both are the most pessimistic single-model reads on those cells.</w:t>
+        <w:t xml:space="preserve">Hypocrisy is the most consensual axis.</w:t>
+      </w:r>
+      <w:r>
+        <w:t xml:space="preserve"> </w:t>
+      </w:r>
+      <w:r>
+        <w:t xml:space="preserve">All three figures’ hypocrisy scores have ≤1 point inter-model range. Models substantively agree that Cromwell (mean 7.33), Robespierre (mean 8.44), and Lincoln (mean 4.0) sit roughly where mainstream historical scholarship places them.</w:t>
       </w:r>
     </w:p>
     <w:p>
@@ -2790,6 +2841,90 @@
         <w:numPr>
           <w:ilvl w:val="0"/>
           <w:numId w:val="1006"/>
+        </w:numPr>
+      </w:pPr>
+      <w:r>
+        <w:rPr>
+          <w:b/>
+          <w:bCs/>
+        </w:rPr>
+        <w:t xml:space="preserve">Lincoln’s honor and integrity are essentially uncontested</w:t>
+      </w:r>
+      <w:r>
+        <w:t xml:space="preserve"> </w:t>
+      </w:r>
+      <w:r>
+        <w:t xml:space="preserve">(means 8.28 and 8.33, both with range 1.0). The Second-Inaugural-Address-anchored read of Lincoln’s character is robust across all nine frontier models.</w:t>
+      </w:r>
+    </w:p>
+    <w:p>
+      <w:pPr>
+        <w:pStyle w:val="Compact"/>
+        <w:numPr>
+          <w:ilvl w:val="0"/>
+          <w:numId w:val="1006"/>
+        </w:numPr>
+      </w:pPr>
+      <w:r>
+        <w:rPr>
+          <w:b/>
+          <w:bCs/>
+        </w:rPr>
+        <w:t xml:space="preserve">Robespierre’s honor is the lowest-scoring cell in the matrix</w:t>
+      </w:r>
+      <w:r>
+        <w:t xml:space="preserve"> </w:t>
+      </w:r>
+      <w:r>
+        <w:t xml:space="preserve">(mean 2.56), again with tight cross-model agreement (range 2.0). Models substantively converge on the Reign of Terror as the dominant evidence for the honor axis.</w:t>
+      </w:r>
+    </w:p>
+    <w:bookmarkEnd w:id="26"/>
+    <w:bookmarkStart w:id="27" w:name="X624ff9d1ab65db281075101918a1d7cae281194"/>
+    <w:p>
+      <w:pPr>
+        <w:pStyle w:val="Heading3"/>
+      </w:pPr>
+      <w:r>
+        <w:t xml:space="preserve">7.4 Per-model patterns (preliminary, n=3 figures)</w:t>
+      </w:r>
+    </w:p>
+    <w:p>
+      <w:pPr>
+        <w:pStyle w:val="FirstParagraph"/>
+      </w:pPr>
+      <w:r>
+        <w:t xml:space="preserve">Two models produce notable outlier patterns at this small scale:</w:t>
+      </w:r>
+    </w:p>
+    <w:p>
+      <w:pPr>
+        <w:pStyle w:val="Compact"/>
+        <w:numPr>
+          <w:ilvl w:val="0"/>
+          <w:numId w:val="1007"/>
+        </w:numPr>
+      </w:pPr>
+      <w:r>
+        <w:rPr>
+          <w:b/>
+          <w:bCs/>
+        </w:rPr>
+        <w:t xml:space="preserve">MiniMax M2.7</w:t>
+      </w:r>
+      <w:r>
+        <w:t xml:space="preserve"> </w:t>
+      </w:r>
+      <w:r>
+        <w:t xml:space="preserve">scores Cromwell on integrity at 4.5 (vs. panel median ≈ 7) and Robespierre on opportunism at 7 (vs. panel median ≈ 4). Both are the most pessimistic single-model reads on those cells.</w:t>
+      </w:r>
+    </w:p>
+    <w:p>
+      <w:pPr>
+        <w:pStyle w:val="Compact"/>
+        <w:numPr>
+          <w:ilvl w:val="0"/>
+          <w:numId w:val="1007"/>
         </w:numPr>
       </w:pPr>
       <w:r>
@@ -3380,7 +3515,7 @@
         <w:pStyle w:val="Compact"/>
         <w:numPr>
           <w:ilvl w:val="0"/>
-          <w:numId w:val="1007"/>
+          <w:numId w:val="1008"/>
         </w:numPr>
       </w:pPr>
       <w:r>
@@ -3395,108 +3530,6 @@
       </w:r>
       <w:r>
         <w:t xml:space="preserve">A consequentialist judgment that pairs the severity of the figure’s actions against the achieved or prevented outcomes. Robespierre’s Terror was extreme; the Republic survived (partly). Cromwell’s military rule was harsh; parliamentary sovereignty was established (partly). Lincoln’s total war was devastating; the Union held and slavery ended. Scalar axis-scoring cannot represent this pairing — it scores the means and ignores the ends.</w:t>
-      </w:r>
-    </w:p>
-    <w:p>
-      <w:pPr>
-        <w:pStyle w:val="Compact"/>
-        <w:numPr>
-          <w:ilvl w:val="0"/>
-          <w:numId w:val="1007"/>
-        </w:numPr>
-      </w:pPr>
-      <w:r>
-        <w:rPr>
-          <w:b/>
-          <w:bCs/>
-        </w:rPr>
-        <w:t xml:space="preserve">Was inaction itself a moral failure?</w:t>
-      </w:r>
-      <w:r>
-        <w:t xml:space="preserve"> </w:t>
-      </w:r>
-      <w:r>
-        <w:t xml:space="preserve">A counterfactual judgment about whether the figure failed to act when opportunity for principled action was available — sins of omission rather than commission. Lincoln on emancipation timing is the canonical case. Scalar axis-scoring conflates</w:t>
-      </w:r>
-      <w:r>
-        <w:t xml:space="preserve"> </w:t>
-      </w:r>
-      <w:r>
-        <w:t xml:space="preserve">“did good things”</w:t>
-      </w:r>
-      <w:r>
-        <w:t xml:space="preserve"> </w:t>
-      </w:r>
-      <w:r>
-        <w:t xml:space="preserve">with</w:t>
-      </w:r>
-      <w:r>
-        <w:t xml:space="preserve"> </w:t>
-      </w:r>
-      <w:r>
-        <w:t xml:space="preserve">“did them as decisively and as early as one could have.”</w:t>
-      </w:r>
-    </w:p>
-    <w:p>
-      <w:pPr>
-        <w:pStyle w:val="Compact"/>
-        <w:numPr>
-          <w:ilvl w:val="0"/>
-          <w:numId w:val="1007"/>
-        </w:numPr>
-      </w:pPr>
-      <w:r>
-        <w:rPr>
-          <w:b/>
-          <w:bCs/>
-        </w:rPr>
-        <w:t xml:space="preserve">Was the action proportionate to the threat?</w:t>
-      </w:r>
-      <w:r>
-        <w:t xml:space="preserve"> </w:t>
-      </w:r>
-      <w:r>
-        <w:t xml:space="preserve">Whether the figure’s response matched the situation’s actual demands rather than its perceived demands. Cromwell at Drogheda; Robespierre against the Hébertists. Scalar scoring on</w:t>
-      </w:r>
-      <w:r>
-        <w:t xml:space="preserve"> </w:t>
-      </w:r>
-      <w:r>
-        <w:rPr>
-          <w:i/>
-          <w:iCs/>
-        </w:rPr>
-        <w:t xml:space="preserve">honor</w:t>
-      </w:r>
-      <w:r>
-        <w:t xml:space="preserve"> </w:t>
-      </w:r>
-      <w:r>
-        <w:t xml:space="preserve">or</w:t>
-      </w:r>
-      <w:r>
-        <w:t xml:space="preserve"> </w:t>
-      </w:r>
-      <w:r>
-        <w:rPr>
-          <w:i/>
-          <w:iCs/>
-        </w:rPr>
-        <w:t xml:space="preserve">cruelty</w:t>
-      </w:r>
-      <w:r>
-        <w:t xml:space="preserve"> </w:t>
-      </w:r>
-      <w:r>
-        <w:t xml:space="preserve">axes does not separate proportionate response under genuine threat from disproportionate response under exaggerated threat.</w:t>
-      </w:r>
-    </w:p>
-    <w:p>
-      <w:pPr>
-        <w:pStyle w:val="FirstParagraph"/>
-      </w:pPr>
-      <w:r>
-        <w:t xml:space="preserve">The methodology’s response to this critique:</w:t>
       </w:r>
     </w:p>
     <w:p>
@@ -3512,26 +3545,31 @@
           <w:b/>
           <w:bCs/>
         </w:rPr>
-        <w:t xml:space="preserve">Acknowledge the limit honestly.</w:t>
-      </w:r>
-      <w:r>
-        <w:t xml:space="preserve"> </w:t>
-      </w:r>
-      <w:r>
-        <w:t xml:space="preserve">Tribunal’s bias-comparator and judge-meta-eval do not produce moral verdicts on figures. They produce a public, sourced, multi-model record of</w:t>
-      </w:r>
-      <w:r>
-        <w:t xml:space="preserve"> </w:t>
-      </w:r>
-      <w:r>
-        <w:rPr>
-          <w:i/>
-          <w:iCs/>
-        </w:rPr>
-        <w:t xml:space="preserve">how each frontier LLM scores contested-character claims under specified conditions</w:t>
-      </w:r>
-      <w:r>
-        <w:t xml:space="preserve">. The methodology’s value is in the inter-model variance and the reliability properties of LLM judges, not in the moral truth of the scores themselves.</w:t>
+        <w:t xml:space="preserve">Was inaction itself a moral failure?</w:t>
+      </w:r>
+      <w:r>
+        <w:t xml:space="preserve"> </w:t>
+      </w:r>
+      <w:r>
+        <w:t xml:space="preserve">A counterfactual judgment about whether the figure failed to act when opportunity for principled action was available — sins of omission rather than commission. Lincoln on emancipation timing is the canonical case. Scalar axis-scoring conflates</w:t>
+      </w:r>
+      <w:r>
+        <w:t xml:space="preserve"> </w:t>
+      </w:r>
+      <w:r>
+        <w:t xml:space="preserve">“did good things”</w:t>
+      </w:r>
+      <w:r>
+        <w:t xml:space="preserve"> </w:t>
+      </w:r>
+      <w:r>
+        <w:t xml:space="preserve">with</w:t>
+      </w:r>
+      <w:r>
+        <w:t xml:space="preserve"> </w:t>
+      </w:r>
+      <w:r>
+        <w:t xml:space="preserve">“did them as decisively and as early as one could have.”</w:t>
       </w:r>
     </w:p>
     <w:p>
@@ -3547,35 +3585,13 @@
           <w:b/>
           <w:bCs/>
         </w:rPr>
-        <w:t xml:space="preserve">Treat scalar axes as the input layer, not the output layer.</w:t>
-      </w:r>
-      <w:r>
-        <w:t xml:space="preserve"> </w:t>
-      </w:r>
-      <w:r>
-        <w:t xml:space="preserve">The four locked v1 axes (hypocrisy, honor, opportunism, integrity) are surface measurements with the property that frontier LLMs can score them with reasonable consistency. Higher-order moral judgments — ends-justify-means, sufficiency-of-action, proportionality — emerge as derived analyses on top of the scalar matrix, not as direct prompt outputs. A figure who scores high on opportunism and low on integrity but achieves outcomes broadly judged necessary by historical scholarship is exactly the kind of pattern the methodology can surface for further analysis.</w:t>
-      </w:r>
-    </w:p>
-    <w:p>
-      <w:pPr>
-        <w:pStyle w:val="Compact"/>
-        <w:numPr>
-          <w:ilvl w:val="0"/>
-          <w:numId w:val="1008"/>
-        </w:numPr>
-      </w:pPr>
-      <w:r>
-        <w:rPr>
-          <w:b/>
-          <w:bCs/>
-        </w:rPr>
-        <w:t xml:space="preserve">Plan structured higher-order axes for Phase 2.</w:t>
-      </w:r>
-      <w:r>
-        <w:t xml:space="preserve"> </w:t>
-      </w:r>
-      <w:r>
-        <w:t xml:space="preserve">The locked v1 axes are deliberately reductive. Phase 2’s eight-axis extension (cruelty, mendacity, vanity, magnanimity, discipline, courage, loyalty, self-knowledge) adds finer-grained character dimensions but does not solve the means/ends or action/inaction question. A separate Phase 2 methodology arm —</w:t>
+        <w:t xml:space="preserve">Was the action proportionate to the threat?</w:t>
+      </w:r>
+      <w:r>
+        <w:t xml:space="preserve"> </w:t>
+      </w:r>
+      <w:r>
+        <w:t xml:space="preserve">Whether the figure’s response matched the situation’s actual demands rather than its perceived demands. Cromwell at Drogheda; Robespierre against the Hébertists. Scalar scoring on</w:t>
       </w:r>
       <w:r>
         <w:t xml:space="preserve"> </w:t>
@@ -3585,35 +3601,13 @@
           <w:i/>
           <w:iCs/>
         </w:rPr>
-        <w:t xml:space="preserve">consequentialist-pairing axes</w:t>
-      </w:r>
-      <w:r>
-        <w:t xml:space="preserve"> </w:t>
-      </w:r>
-      <w:r>
-        <w:t xml:space="preserve">— is opened by this critique: paired (means, ends) cells where the means axis scores severity and the ends axis scores achievement, evaluated on the same figure-event. This is added to the methodology roadmap as an explicit future contribution.</w:t>
-      </w:r>
-    </w:p>
-    <w:p>
-      <w:pPr>
-        <w:pStyle w:val="Compact"/>
-        <w:numPr>
-          <w:ilvl w:val="0"/>
-          <w:numId w:val="1008"/>
-        </w:numPr>
-      </w:pPr>
-      <w:r>
-        <w:rPr>
-          <w:b/>
-          <w:bCs/>
-        </w:rPr>
-        <w:t xml:space="preserve">Use Track B to surface the higher-order question.</w:t>
-      </w:r>
-      <w:r>
-        <w:t xml:space="preserve"> </w:t>
-      </w:r>
-      <w:r>
-        <w:t xml:space="preserve">The debate format (Track B) is structurally suited to means/ends and action/inaction debates — debaters can argue</w:t>
+        <w:t xml:space="preserve">honor</w:t>
+      </w:r>
+      <w:r>
+        <w:t xml:space="preserve"> </w:t>
+      </w:r>
+      <w:r>
+        <w:t xml:space="preserve">or</w:t>
       </w:r>
       <w:r>
         <w:t xml:space="preserve"> </w:t>
@@ -3623,29 +3617,13 @@
           <w:i/>
           <w:iCs/>
         </w:rPr>
-        <w:t xml:space="preserve">“the means were severe but proportionate to the threat”</w:t>
-      </w:r>
-      <w:r>
-        <w:t xml:space="preserve"> </w:t>
-      </w:r>
-      <w:r>
-        <w:t xml:space="preserve">against</w:t>
-      </w:r>
-      <w:r>
-        <w:t xml:space="preserve"> </w:t>
-      </w:r>
-      <w:r>
-        <w:rPr>
-          <w:i/>
-          <w:iCs/>
-        </w:rPr>
-        <w:t xml:space="preserve">“the means exceeded what the threat required”</w:t>
-      </w:r>
-      <w:r>
-        <w:t xml:space="preserve"> </w:t>
-      </w:r>
-      <w:r>
-        <w:t xml:space="preserve">in a way that the scalar Track A cannot. The judge meta-eval can then measure whether LLM judges adjudicate higher-order moral debates as reliably as they adjudicate scalar character claims.</w:t>
+        <w:t xml:space="preserve">cruelty</w:t>
+      </w:r>
+      <w:r>
+        <w:t xml:space="preserve"> </w:t>
+      </w:r>
+      <w:r>
+        <w:t xml:space="preserve">axes does not separate proportionate response under genuine threat from disproportionate response under exaggerated threat.</w:t>
       </w:r>
     </w:p>
     <w:p>
@@ -3653,156 +3631,7 @@
         <w:pStyle w:val="FirstParagraph"/>
       </w:pPr>
       <w:r>
-        <w:t xml:space="preserve">In short: the methodology paper does not claim to score the moral truth about these figures. It claims to measure how frontier LLMs score them, where they agree, where they disagree, and whether LLM judges can be trusted to adjudicate the disagreements. The scalar axes are an instrument; the higher-order questions are research products that can be built on the instrument’s output. The instrument’s limit is real and is named.</w:t>
-      </w:r>
-    </w:p>
-    <w:bookmarkEnd w:id="30"/>
-    <w:bookmarkEnd w:id="31"/>
-    <w:bookmarkStart w:id="32" w:name="discussion"/>
-    <w:p>
-      <w:pPr>
-        <w:pStyle w:val="Heading2"/>
-      </w:pPr>
-      <w:r>
-        <w:t xml:space="preserve">8. Discussion</w:t>
-      </w:r>
-    </w:p>
-    <w:p>
-      <w:pPr>
-        <w:pStyle w:val="FirstParagraph"/>
-      </w:pPr>
-      <w:r>
-        <w:rPr>
-          <w:b/>
-          <w:bCs/>
-        </w:rPr>
-        <w:t xml:space="preserve">Implications for scalable oversight.</w:t>
-      </w:r>
-      <w:r>
-        <w:t xml:space="preserve"> </w:t>
-      </w:r>
-      <w:r>
-        <w:t xml:space="preserve">Debate-as-alignment proposals have largely assumed honest, calibrated judges. Track B is one attempt at the empirical answer for whether LLM judges meet that bar in the conditions under which the question matters.</w:t>
-      </w:r>
-    </w:p>
-    <w:p>
-      <w:pPr>
-        <w:pStyle w:val="BodyText"/>
-      </w:pPr>
-      <w:r>
-        <w:rPr>
-          <w:b/>
-          <w:bCs/>
-        </w:rPr>
-        <w:t xml:space="preserve">Implications for political-bias measurement.</w:t>
-      </w:r>
-      <w:r>
-        <w:t xml:space="preserve"> </w:t>
-      </w:r>
-      <w:r>
-        <w:t xml:space="preserve">Track A is one attempt at a per-figure, multi-axis, multi-model bias map that goes beyond ideological-positioning instruments. Combined with Track B’s mechanistic probe, the methodology offers a path past the</w:t>
-      </w:r>
-      <w:r>
-        <w:t xml:space="preserve"> </w:t>
-      </w:r>
-      <w:r>
-        <w:t xml:space="preserve">“is Model X biased?”</w:t>
-      </w:r>
-      <w:r>
-        <w:t xml:space="preserve"> </w:t>
-      </w:r>
-      <w:r>
-        <w:t xml:space="preserve">yes-or-no debate toward</w:t>
-      </w:r>
-      <w:r>
-        <w:t xml:space="preserve"> </w:t>
-      </w:r>
-      <w:r>
-        <w:t xml:space="preserve">“where, on what, and how robustly is each model biased relative to the others?”</w:t>
-      </w:r>
-    </w:p>
-    <w:p>
-      <w:pPr>
-        <w:pStyle w:val="BodyText"/>
-      </w:pPr>
-      <w:r>
-        <w:rPr>
-          <w:b/>
-          <w:bCs/>
-        </w:rPr>
-        <w:t xml:space="preserve">AI deference.</w:t>
-      </w:r>
-      <w:r>
-        <w:t xml:space="preserve"> </w:t>
-      </w:r>
-      <w:r>
-        <w:t xml:space="preserve">Single-shot LLM scoring of contested questions trains readers to defer (</w:t>
-      </w:r>
-      <w:r>
-        <w:t xml:space="preserve">“the AI says 9”</w:t>
-      </w:r>
-      <w:r>
-        <w:t xml:space="preserve">). Track A’s design —</w:t>
-      </w:r>
-      <w:r>
-        <w:t xml:space="preserve"> </w:t>
-      </w:r>
-      <w:r>
-        <w:rPr>
-          <w:i/>
-          <w:iCs/>
-        </w:rPr>
-        <w:t xml:space="preserve">show the spread, not the score</w:t>
-      </w:r>
-      <w:r>
-        <w:t xml:space="preserve"> </w:t>
-      </w:r>
-      <w:r>
-        <w:t xml:space="preserve">— and Track B’s design —</w:t>
-      </w:r>
-      <w:r>
-        <w:t xml:space="preserve"> </w:t>
-      </w:r>
-      <w:r>
-        <w:rPr>
-          <w:i/>
-          <w:iCs/>
-        </w:rPr>
-        <w:t xml:space="preserve">show the debate, then the verdict</w:t>
-      </w:r>
-      <w:r>
-        <w:t xml:space="preserve"> </w:t>
-      </w:r>
-      <w:r>
-        <w:t xml:space="preserve">— are both attempts to invert that deference dynamic. The product mechanic carries the design philosophy.</w:t>
-      </w:r>
-    </w:p>
-    <w:p>
-      <w:pPr>
-        <w:pStyle w:val="BodyText"/>
-      </w:pPr>
-      <w:r>
-        <w:rPr>
-          <w:b/>
-          <w:bCs/>
-        </w:rPr>
-        <w:t xml:space="preserve">Plural benchmarks.</w:t>
-      </w:r>
-      <w:r>
-        <w:t xml:space="preserve"> </w:t>
-      </w:r>
-      <w:r>
-        <w:t xml:space="preserve">A field in which a small number of US-hosted leaderboards govern the comparative reputation of all frontier models is not robust. Tribunal is one attempt at a sovereign, jurisdictionally independent benchmark in a different methodological lineage. We argue more should exist, in more jurisdictions, with overlapping but non-identical methodologies.</w:t>
-      </w:r>
-    </w:p>
-    <w:bookmarkEnd w:id="32"/>
-    <w:bookmarkStart w:id="33" w:name="artifact-roadmap-and-release-cadence"/>
-    <w:p>
-      <w:pPr>
-        <w:pStyle w:val="Heading2"/>
-      </w:pPr>
-      <w:r>
-        <w:t xml:space="preserve">9. Artifact roadmap and release cadence</w:t>
+        <w:t xml:space="preserve">The methodology’s response to this critique:</w:t>
       </w:r>
     </w:p>
     <w:p>
@@ -3818,13 +3647,26 @@
           <w:b/>
           <w:bCs/>
         </w:rPr>
-        <w:t xml:space="preserve">Phase 0</w:t>
-      </w:r>
-      <w:r>
-        <w:t xml:space="preserve"> </w:t>
-      </w:r>
-      <w:r>
-        <w:t xml:space="preserve">(now): position paper skeleton, governance and identity documents, prototype spec for both tracks.</w:t>
+        <w:t xml:space="preserve">Acknowledge the limit honestly.</w:t>
+      </w:r>
+      <w:r>
+        <w:t xml:space="preserve"> </w:t>
+      </w:r>
+      <w:r>
+        <w:t xml:space="preserve">Tribunal’s bias-comparator and judge-meta-eval do not produce moral verdicts on figures. They produce a public, sourced, multi-model record of</w:t>
+      </w:r>
+      <w:r>
+        <w:t xml:space="preserve"> </w:t>
+      </w:r>
+      <w:r>
+        <w:rPr>
+          <w:i/>
+          <w:iCs/>
+        </w:rPr>
+        <w:t xml:space="preserve">how each frontier LLM scores contested-character claims under specified conditions</w:t>
+      </w:r>
+      <w:r>
+        <w:t xml:space="preserve">. The methodology’s value is in the inter-model variance and the reliability properties of LLM judges, not in the moral truth of the scores themselves.</w:t>
       </w:r>
     </w:p>
     <w:p>
@@ -3840,13 +3682,13 @@
           <w:b/>
           <w:bCs/>
         </w:rPr>
-        <w:t xml:space="preserve">Phase 1</w:t>
-      </w:r>
-      <w:r>
-        <w:t xml:space="preserve"> </w:t>
-      </w:r>
-      <w:r>
-        <w:t xml:space="preserve">(1–4 weeks): Track A bias comparator MVP on ~10–15 mixed-roster figures × 4 axes × 5 models; small Track B debate proof-of-concept on 2–3 highest-variance cells; HF dataset v0.1 (unlisted).</w:t>
+        <w:t xml:space="preserve">Treat scalar axes as the input layer, not the output layer.</w:t>
+      </w:r>
+      <w:r>
+        <w:t xml:space="preserve"> </w:t>
+      </w:r>
+      <w:r>
+        <w:t xml:space="preserve">The four locked v1 axes (hypocrisy, honor, opportunism, integrity) are surface measurements with the property that frontier LLMs can score them with reasonable consistency. Higher-order moral judgments — ends-justify-means, sufficiency-of-action, proportionality — emerge as derived analyses on top of the scalar matrix, not as direct prompt outputs. A figure who scores high on opportunism and low on integrity but achieves outcomes broadly judged necessary by historical scholarship is exactly the kind of pattern the methodology can surface for further analysis.</w:t>
       </w:r>
     </w:p>
     <w:p>
@@ -3862,13 +3704,29 @@
           <w:b/>
           <w:bCs/>
         </w:rPr>
-        <w:t xml:space="preserve">Phase 2</w:t>
-      </w:r>
-      <w:r>
-        <w:t xml:space="preserve"> </w:t>
-      </w:r>
-      <w:r>
-        <w:t xml:space="preserve">(1–3 months): Track A scaled to 30–50 figures × 8 axes × 8 frontier models; full Track B adversarial probes and human-jury subsample; arXiv preprint (this paper, with empirical results); custom leaderboard site live; formal HF release.</w:t>
+        <w:t xml:space="preserve">Plan structured higher-order axes for Phase 2.</w:t>
+      </w:r>
+      <w:r>
+        <w:t xml:space="preserve"> </w:t>
+      </w:r>
+      <w:r>
+        <w:t xml:space="preserve">The locked v1 axes are deliberately reductive. Phase 2’s eight-axis extension (cruelty, mendacity, vanity, magnanimity, discipline, courage, loyalty, self-knowledge) adds finer-grained character dimensions but does not solve the means/ends or action/inaction question. A separate Phase 2 methodology arm —</w:t>
+      </w:r>
+      <w:r>
+        <w:t xml:space="preserve"> </w:t>
+      </w:r>
+      <w:r>
+        <w:rPr>
+          <w:i/>
+          <w:iCs/>
+        </w:rPr>
+        <w:t xml:space="preserve">consequentialist-pairing axes</w:t>
+      </w:r>
+      <w:r>
+        <w:t xml:space="preserve"> </w:t>
+      </w:r>
+      <w:r>
+        <w:t xml:space="preserve">— is opened by this critique: paired (means, ends) cells where the means axis scores severity and the ends axis scores achievement, evaluated on the same figure-event. This is added to the methodology roadmap as an explicit future contribution.</w:t>
       </w:r>
     </w:p>
     <w:p>
@@ -3884,42 +3742,202 @@
           <w:b/>
           <w:bCs/>
         </w:rPr>
-        <w:t xml:space="preserve">Phase 3</w:t>
-      </w:r>
-      <w:r>
-        <w:t xml:space="preserve"> </w:t>
-      </w:r>
-      <w:r>
-        <w:t xml:space="preserve">(3–6 months): contemporary-figure roster expansion with full COI protocols; coordinated press cycle; conference workshop submission.</w:t>
-      </w:r>
-    </w:p>
-    <w:p>
-      <w:pPr>
-        <w:pStyle w:val="Compact"/>
-        <w:numPr>
-          <w:ilvl w:val="0"/>
-          <w:numId w:val="1009"/>
-        </w:numPr>
-      </w:pPr>
-      <w:r>
-        <w:rPr>
-          <w:b/>
-          <w:bCs/>
-        </w:rPr>
-        <w:t xml:space="preserve">Ongoing</w:t>
-      </w:r>
-      <w:r>
-        <w:t xml:space="preserve">: quarterly version bumps; community-PR governance; recurring frontier-model report card.</w:t>
-      </w:r>
-    </w:p>
-    <w:bookmarkEnd w:id="33"/>
-    <w:bookmarkStart w:id="34" w:name="references-sketch"/>
+        <w:t xml:space="preserve">Use Track B to surface the higher-order question.</w:t>
+      </w:r>
+      <w:r>
+        <w:t xml:space="preserve"> </w:t>
+      </w:r>
+      <w:r>
+        <w:t xml:space="preserve">The debate format (Track B) is structurally suited to means/ends and action/inaction debates — debaters can argue</w:t>
+      </w:r>
+      <w:r>
+        <w:t xml:space="preserve"> </w:t>
+      </w:r>
+      <w:r>
+        <w:rPr>
+          <w:i/>
+          <w:iCs/>
+        </w:rPr>
+        <w:t xml:space="preserve">“the means were severe but proportionate to the threat”</w:t>
+      </w:r>
+      <w:r>
+        <w:t xml:space="preserve"> </w:t>
+      </w:r>
+      <w:r>
+        <w:t xml:space="preserve">against</w:t>
+      </w:r>
+      <w:r>
+        <w:t xml:space="preserve"> </w:t>
+      </w:r>
+      <w:r>
+        <w:rPr>
+          <w:i/>
+          <w:iCs/>
+        </w:rPr>
+        <w:t xml:space="preserve">“the means exceeded what the threat required”</w:t>
+      </w:r>
+      <w:r>
+        <w:t xml:space="preserve"> </w:t>
+      </w:r>
+      <w:r>
+        <w:t xml:space="preserve">in a way that the scalar Track A cannot. The judge meta-eval can then measure whether LLM judges adjudicate higher-order moral debates as reliably as they adjudicate scalar character claims.</w:t>
+      </w:r>
+    </w:p>
+    <w:p>
+      <w:pPr>
+        <w:pStyle w:val="FirstParagraph"/>
+      </w:pPr>
+      <w:r>
+        <w:t xml:space="preserve">In short: the methodology paper does not claim to score the moral truth about these figures. It claims to measure how frontier LLMs score them, where they agree, where they disagree, and whether LLM judges can be trusted to adjudicate the disagreements. The scalar axes are an instrument; the higher-order questions are research products that can be built on the instrument’s output. The instrument’s limit is real and is named.</w:t>
+      </w:r>
+    </w:p>
+    <w:bookmarkEnd w:id="30"/>
+    <w:bookmarkEnd w:id="31"/>
+    <w:bookmarkStart w:id="32" w:name="discussion"/>
     <w:p>
       <w:pPr>
         <w:pStyle w:val="Heading2"/>
       </w:pPr>
       <w:r>
-        <w:t xml:space="preserve">10. References (sketch)</w:t>
+        <w:t xml:space="preserve">8. Discussion</w:t>
+      </w:r>
+    </w:p>
+    <w:p>
+      <w:pPr>
+        <w:pStyle w:val="FirstParagraph"/>
+      </w:pPr>
+      <w:r>
+        <w:rPr>
+          <w:b/>
+          <w:bCs/>
+        </w:rPr>
+        <w:t xml:space="preserve">Implications for scalable oversight.</w:t>
+      </w:r>
+      <w:r>
+        <w:t xml:space="preserve"> </w:t>
+      </w:r>
+      <w:r>
+        <w:t xml:space="preserve">Debate-as-alignment proposals have largely assumed honest, calibrated judges. Track B is one attempt at the empirical answer for whether LLM judges meet that bar in the conditions under which the question matters.</w:t>
+      </w:r>
+    </w:p>
+    <w:p>
+      <w:pPr>
+        <w:pStyle w:val="BodyText"/>
+      </w:pPr>
+      <w:r>
+        <w:rPr>
+          <w:b/>
+          <w:bCs/>
+        </w:rPr>
+        <w:t xml:space="preserve">Implications for political-bias measurement.</w:t>
+      </w:r>
+      <w:r>
+        <w:t xml:space="preserve"> </w:t>
+      </w:r>
+      <w:r>
+        <w:t xml:space="preserve">Track A is one attempt at a per-figure, multi-axis, multi-model bias map that goes beyond ideological-positioning instruments. Combined with Track B’s mechanistic probe, the methodology offers a path past the</w:t>
+      </w:r>
+      <w:r>
+        <w:t xml:space="preserve"> </w:t>
+      </w:r>
+      <w:r>
+        <w:t xml:space="preserve">“is Model X biased?”</w:t>
+      </w:r>
+      <w:r>
+        <w:t xml:space="preserve"> </w:t>
+      </w:r>
+      <w:r>
+        <w:t xml:space="preserve">yes-or-no debate toward</w:t>
+      </w:r>
+      <w:r>
+        <w:t xml:space="preserve"> </w:t>
+      </w:r>
+      <w:r>
+        <w:t xml:space="preserve">“where, on what, and how robustly is each model biased relative to the others?”</w:t>
+      </w:r>
+    </w:p>
+    <w:p>
+      <w:pPr>
+        <w:pStyle w:val="BodyText"/>
+      </w:pPr>
+      <w:r>
+        <w:rPr>
+          <w:b/>
+          <w:bCs/>
+        </w:rPr>
+        <w:t xml:space="preserve">AI deference.</w:t>
+      </w:r>
+      <w:r>
+        <w:t xml:space="preserve"> </w:t>
+      </w:r>
+      <w:r>
+        <w:t xml:space="preserve">Single-shot LLM scoring of contested questions trains readers to defer (</w:t>
+      </w:r>
+      <w:r>
+        <w:t xml:space="preserve">“the AI says 9”</w:t>
+      </w:r>
+      <w:r>
+        <w:t xml:space="preserve">). Track A’s design —</w:t>
+      </w:r>
+      <w:r>
+        <w:t xml:space="preserve"> </w:t>
+      </w:r>
+      <w:r>
+        <w:rPr>
+          <w:i/>
+          <w:iCs/>
+        </w:rPr>
+        <w:t xml:space="preserve">show the spread, not the score</w:t>
+      </w:r>
+      <w:r>
+        <w:t xml:space="preserve"> </w:t>
+      </w:r>
+      <w:r>
+        <w:t xml:space="preserve">— and Track B’s design —</w:t>
+      </w:r>
+      <w:r>
+        <w:t xml:space="preserve"> </w:t>
+      </w:r>
+      <w:r>
+        <w:rPr>
+          <w:i/>
+          <w:iCs/>
+        </w:rPr>
+        <w:t xml:space="preserve">show the debate, then the verdict</w:t>
+      </w:r>
+      <w:r>
+        <w:t xml:space="preserve"> </w:t>
+      </w:r>
+      <w:r>
+        <w:t xml:space="preserve">— are both attempts to invert that deference dynamic. The product mechanic carries the design philosophy.</w:t>
+      </w:r>
+    </w:p>
+    <w:p>
+      <w:pPr>
+        <w:pStyle w:val="BodyText"/>
+      </w:pPr>
+      <w:r>
+        <w:rPr>
+          <w:b/>
+          <w:bCs/>
+        </w:rPr>
+        <w:t xml:space="preserve">Plural benchmarks.</w:t>
+      </w:r>
+      <w:r>
+        <w:t xml:space="preserve"> </w:t>
+      </w:r>
+      <w:r>
+        <w:t xml:space="preserve">A field in which a small number of US-hosted leaderboards govern the comparative reputation of all frontier models is not robust. Tribunal is one attempt at a sovereign, jurisdictionally independent benchmark in a different methodological lineage. We argue more should exist, in more jurisdictions, with overlapping but non-identical methodologies.</w:t>
+      </w:r>
+    </w:p>
+    <w:bookmarkEnd w:id="32"/>
+    <w:bookmarkStart w:id="33" w:name="artifact-roadmap-and-release-cadence"/>
+    <w:p>
+      <w:pPr>
+        <w:pStyle w:val="Heading2"/>
+      </w:pPr>
+      <w:r>
+        <w:t xml:space="preserve">9. Artifact roadmap and release cadence</w:t>
       </w:r>
     </w:p>
     <w:p>
@@ -3931,23 +3949,17 @@
         </w:numPr>
       </w:pPr>
       <w:r>
-        <w:t xml:space="preserve">Irving, G., Christiano, P., &amp; Amodei, D. (2018).</w:t>
-      </w:r>
-      <w:r>
-        <w:t xml:space="preserve"> </w:t>
-      </w:r>
-      <w:r>
-        <w:rPr>
-          <w:i/>
-          <w:iCs/>
-        </w:rPr>
-        <w:t xml:space="preserve">AI safety via debate.</w:t>
-      </w:r>
-      <w:r>
-        <w:t xml:space="preserve"> </w:t>
-      </w:r>
-      <w:r>
-        <w:t xml:space="preserve">arXiv:1805.00899.</w:t>
+        <w:rPr>
+          <w:b/>
+          <w:bCs/>
+        </w:rPr>
+        <w:t xml:space="preserve">Phase 0</w:t>
+      </w:r>
+      <w:r>
+        <w:t xml:space="preserve"> </w:t>
+      </w:r>
+      <w:r>
+        <w:t xml:space="preserve">(now): position paper skeleton, governance and identity documents, prototype spec for both tracks.</w:t>
       </w:r>
     </w:p>
     <w:p>
@@ -3959,23 +3971,17 @@
         </w:numPr>
       </w:pPr>
       <w:r>
-        <w:t xml:space="preserve">Zheng, L., et al. (2023).</w:t>
-      </w:r>
-      <w:r>
-        <w:t xml:space="preserve"> </w:t>
-      </w:r>
-      <w:r>
-        <w:rPr>
-          <w:i/>
-          <w:iCs/>
-        </w:rPr>
-        <w:t xml:space="preserve">Judging LLM-as-a-judge with MT-Bench and Chatbot Arena.</w:t>
-      </w:r>
-      <w:r>
-        <w:t xml:space="preserve"> </w:t>
-      </w:r>
-      <w:r>
-        <w:t xml:space="preserve">NeurIPS.</w:t>
+        <w:rPr>
+          <w:b/>
+          <w:bCs/>
+        </w:rPr>
+        <w:t xml:space="preserve">Phase 1</w:t>
+      </w:r>
+      <w:r>
+        <w:t xml:space="preserve"> </w:t>
+      </w:r>
+      <w:r>
+        <w:t xml:space="preserve">(1–4 weeks): Track A bias comparator MVP on ~10–15 mixed-roster figures × 4 axes × 5 models; small Track B debate proof-of-concept on 2–3 highest-variance cells; HF dataset v0.1 (unlisted).</w:t>
       </w:r>
     </w:p>
     <w:p>
@@ -3987,7 +3993,17 @@
         </w:numPr>
       </w:pPr>
       <w:r>
-        <w:t xml:space="preserve">Wang, P., et al. (2024). Large language models are not fair evaluators.</w:t>
+        <w:rPr>
+          <w:b/>
+          <w:bCs/>
+        </w:rPr>
+        <w:t xml:space="preserve">Phase 2</w:t>
+      </w:r>
+      <w:r>
+        <w:t xml:space="preserve"> </w:t>
+      </w:r>
+      <w:r>
+        <w:t xml:space="preserve">(1–3 months): Track A scaled to 30–50 figures × 8 axes × 8 frontier models; full Track B adversarial probes and human-jury subsample; arXiv preprint (this paper, with empirical results); custom leaderboard site live; formal HF release.</w:t>
       </w:r>
     </w:p>
     <w:p>
@@ -3999,23 +4015,17 @@
         </w:numPr>
       </w:pPr>
       <w:r>
-        <w:t xml:space="preserve">Santurkar, S., et al. (2023).</w:t>
-      </w:r>
-      <w:r>
-        <w:t xml:space="preserve"> </w:t>
-      </w:r>
-      <w:r>
-        <w:rPr>
-          <w:i/>
-          <w:iCs/>
-        </w:rPr>
-        <w:t xml:space="preserve">Whose opinions do language models reflect?</w:t>
-      </w:r>
-      <w:r>
-        <w:t xml:space="preserve"> </w:t>
-      </w:r>
-      <w:r>
-        <w:t xml:space="preserve">ICML.</w:t>
+        <w:rPr>
+          <w:b/>
+          <w:bCs/>
+        </w:rPr>
+        <w:t xml:space="preserve">Phase 3</w:t>
+      </w:r>
+      <w:r>
+        <w:t xml:space="preserve"> </w:t>
+      </w:r>
+      <w:r>
+        <w:t xml:space="preserve">(3–6 months): contemporary-figure roster expansion with full COI protocols; coordinated press cycle; conference workshop submission.</w:t>
       </w:r>
     </w:p>
     <w:p>
@@ -4027,23 +4037,24 @@
         </w:numPr>
       </w:pPr>
       <w:r>
-        <w:t xml:space="preserve">Rozado, D. (2023).</w:t>
-      </w:r>
-      <w:r>
-        <w:t xml:space="preserve"> </w:t>
-      </w:r>
-      <w:r>
-        <w:rPr>
-          <w:i/>
-          <w:iCs/>
-        </w:rPr>
-        <w:t xml:space="preserve">The political biases of ChatGPT.</w:t>
-      </w:r>
-      <w:r>
-        <w:t xml:space="preserve"> </w:t>
-      </w:r>
-      <w:r>
-        <w:t xml:space="preserve">Social Sciences.</w:t>
+        <w:rPr>
+          <w:b/>
+          <w:bCs/>
+        </w:rPr>
+        <w:t xml:space="preserve">Ongoing</w:t>
+      </w:r>
+      <w:r>
+        <w:t xml:space="preserve">: quarterly version bumps; community-PR governance; recurring frontier-model report card.</w:t>
+      </w:r>
+    </w:p>
+    <w:bookmarkEnd w:id="33"/>
+    <w:bookmarkStart w:id="34" w:name="references-sketch"/>
+    <w:p>
+      <w:pPr>
+        <w:pStyle w:val="Heading2"/>
+      </w:pPr>
+      <w:r>
+        <w:t xml:space="preserve">10. References (sketch)</w:t>
       </w:r>
     </w:p>
     <w:p>
@@ -4051,11 +4062,11 @@
         <w:pStyle w:val="Compact"/>
         <w:numPr>
           <w:ilvl w:val="0"/>
-          <w:numId w:val="1010"/>
+          <w:numId w:val="1011"/>
         </w:numPr>
       </w:pPr>
       <w:r>
-        <w:t xml:space="preserve">Bai, Y., et al. (2022).</w:t>
+        <w:t xml:space="preserve">Irving, G., Christiano, P., &amp; Amodei, D. (2018).</w:t>
       </w:r>
       <w:r>
         <w:t xml:space="preserve"> </w:t>
@@ -4065,13 +4076,13 @@
           <w:i/>
           <w:iCs/>
         </w:rPr>
-        <w:t xml:space="preserve">Constitutional AI: Harmlessness from AI feedback.</w:t>
-      </w:r>
-      <w:r>
-        <w:t xml:space="preserve"> </w:t>
-      </w:r>
-      <w:r>
-        <w:t xml:space="preserve">Anthropic.</w:t>
+        <w:t xml:space="preserve">AI safety via debate.</w:t>
+      </w:r>
+      <w:r>
+        <w:t xml:space="preserve"> </w:t>
+      </w:r>
+      <w:r>
+        <w:t xml:space="preserve">arXiv:1805.00899.</w:t>
       </w:r>
     </w:p>
     <w:p>
@@ -4079,11 +4090,11 @@
         <w:pStyle w:val="Compact"/>
         <w:numPr>
           <w:ilvl w:val="0"/>
-          <w:numId w:val="1010"/>
+          <w:numId w:val="1011"/>
         </w:numPr>
       </w:pPr>
       <w:r>
-        <w:t xml:space="preserve">Christiano, P., Shlegeris, B., &amp; Amodei, D. (2018).</w:t>
+        <w:t xml:space="preserve">Zheng, L., et al. (2023).</w:t>
       </w:r>
       <w:r>
         <w:t xml:space="preserve"> </w:t>
@@ -4093,7 +4104,13 @@
           <w:i/>
           <w:iCs/>
         </w:rPr>
-        <w:t xml:space="preserve">Supervising strong learners by amplifying weak experts.</w:t>
+        <w:t xml:space="preserve">Judging LLM-as-a-judge with MT-Bench and Chatbot Arena.</w:t>
+      </w:r>
+      <w:r>
+        <w:t xml:space="preserve"> </w:t>
+      </w:r>
+      <w:r>
+        <w:t xml:space="preserve">NeurIPS.</w:t>
       </w:r>
     </w:p>
     <w:p>
@@ -4101,27 +4118,11 @@
         <w:pStyle w:val="Compact"/>
         <w:numPr>
           <w:ilvl w:val="0"/>
-          <w:numId w:val="1010"/>
+          <w:numId w:val="1011"/>
         </w:numPr>
       </w:pPr>
       <w:r>
-        <w:t xml:space="preserve">Burns, C., et al. (2024).</w:t>
-      </w:r>
-      <w:r>
-        <w:t xml:space="preserve"> </w:t>
-      </w:r>
-      <w:r>
-        <w:rPr>
-          <w:i/>
-          <w:iCs/>
-        </w:rPr>
-        <w:t xml:space="preserve">Weak-to-strong generalization.</w:t>
-      </w:r>
-      <w:r>
-        <w:t xml:space="preserve"> </w:t>
-      </w:r>
-      <w:r>
-        <w:t xml:space="preserve">OpenAI.</w:t>
+        <w:t xml:space="preserve">Wang, P., et al. (2024). Large language models are not fair evaluators.</w:t>
       </w:r>
     </w:p>
     <w:p>
@@ -4129,11 +4130,11 @@
         <w:pStyle w:val="Compact"/>
         <w:numPr>
           <w:ilvl w:val="0"/>
-          <w:numId w:val="1010"/>
+          <w:numId w:val="1011"/>
         </w:numPr>
       </w:pPr>
       <w:r>
-        <w:t xml:space="preserve">Krippendorff, K. (2004).</w:t>
+        <w:t xml:space="preserve">Santurkar, S., et al. (2023).</w:t>
       </w:r>
       <w:r>
         <w:t xml:space="preserve"> </w:t>
@@ -4143,7 +4144,13 @@
           <w:i/>
           <w:iCs/>
         </w:rPr>
-        <w:t xml:space="preserve">Content analysis: An introduction to its methodology.</w:t>
+        <w:t xml:space="preserve">Whose opinions do language models reflect?</w:t>
+      </w:r>
+      <w:r>
+        <w:t xml:space="preserve"> </w:t>
+      </w:r>
+      <w:r>
+        <w:t xml:space="preserve">ICML.</w:t>
       </w:r>
     </w:p>
     <w:p>
@@ -4151,7 +4158,135 @@
         <w:pStyle w:val="Compact"/>
         <w:numPr>
           <w:ilvl w:val="0"/>
-          <w:numId w:val="1010"/>
+          <w:numId w:val="1011"/>
+        </w:numPr>
+      </w:pPr>
+      <w:r>
+        <w:t xml:space="preserve">Rozado, D. (2023).</w:t>
+      </w:r>
+      <w:r>
+        <w:t xml:space="preserve"> </w:t>
+      </w:r>
+      <w:r>
+        <w:rPr>
+          <w:i/>
+          <w:iCs/>
+        </w:rPr>
+        <w:t xml:space="preserve">The political biases of ChatGPT.</w:t>
+      </w:r>
+      <w:r>
+        <w:t xml:space="preserve"> </w:t>
+      </w:r>
+      <w:r>
+        <w:t xml:space="preserve">Social Sciences.</w:t>
+      </w:r>
+    </w:p>
+    <w:p>
+      <w:pPr>
+        <w:pStyle w:val="Compact"/>
+        <w:numPr>
+          <w:ilvl w:val="0"/>
+          <w:numId w:val="1011"/>
+        </w:numPr>
+      </w:pPr>
+      <w:r>
+        <w:t xml:space="preserve">Bai, Y., et al. (2022).</w:t>
+      </w:r>
+      <w:r>
+        <w:t xml:space="preserve"> </w:t>
+      </w:r>
+      <w:r>
+        <w:rPr>
+          <w:i/>
+          <w:iCs/>
+        </w:rPr>
+        <w:t xml:space="preserve">Constitutional AI: Harmlessness from AI feedback.</w:t>
+      </w:r>
+      <w:r>
+        <w:t xml:space="preserve"> </w:t>
+      </w:r>
+      <w:r>
+        <w:t xml:space="preserve">Anthropic.</w:t>
+      </w:r>
+    </w:p>
+    <w:p>
+      <w:pPr>
+        <w:pStyle w:val="Compact"/>
+        <w:numPr>
+          <w:ilvl w:val="0"/>
+          <w:numId w:val="1011"/>
+        </w:numPr>
+      </w:pPr>
+      <w:r>
+        <w:t xml:space="preserve">Christiano, P., Shlegeris, B., &amp; Amodei, D. (2018).</w:t>
+      </w:r>
+      <w:r>
+        <w:t xml:space="preserve"> </w:t>
+      </w:r>
+      <w:r>
+        <w:rPr>
+          <w:i/>
+          <w:iCs/>
+        </w:rPr>
+        <w:t xml:space="preserve">Supervising strong learners by amplifying weak experts.</w:t>
+      </w:r>
+    </w:p>
+    <w:p>
+      <w:pPr>
+        <w:pStyle w:val="Compact"/>
+        <w:numPr>
+          <w:ilvl w:val="0"/>
+          <w:numId w:val="1011"/>
+        </w:numPr>
+      </w:pPr>
+      <w:r>
+        <w:t xml:space="preserve">Burns, C., et al. (2024).</w:t>
+      </w:r>
+      <w:r>
+        <w:t xml:space="preserve"> </w:t>
+      </w:r>
+      <w:r>
+        <w:rPr>
+          <w:i/>
+          <w:iCs/>
+        </w:rPr>
+        <w:t xml:space="preserve">Weak-to-strong generalization.</w:t>
+      </w:r>
+      <w:r>
+        <w:t xml:space="preserve"> </w:t>
+      </w:r>
+      <w:r>
+        <w:t xml:space="preserve">OpenAI.</w:t>
+      </w:r>
+    </w:p>
+    <w:p>
+      <w:pPr>
+        <w:pStyle w:val="Compact"/>
+        <w:numPr>
+          <w:ilvl w:val="0"/>
+          <w:numId w:val="1011"/>
+        </w:numPr>
+      </w:pPr>
+      <w:r>
+        <w:t xml:space="preserve">Krippendorff, K. (2004).</w:t>
+      </w:r>
+      <w:r>
+        <w:t xml:space="preserve"> </w:t>
+      </w:r>
+      <w:r>
+        <w:rPr>
+          <w:i/>
+          <w:iCs/>
+        </w:rPr>
+        <w:t xml:space="preserve">Content analysis: An introduction to its methodology.</w:t>
+      </w:r>
+    </w:p>
+    <w:p>
+      <w:pPr>
+        <w:pStyle w:val="Compact"/>
+        <w:numPr>
+          <w:ilvl w:val="0"/>
+          <w:numId w:val="1011"/>
         </w:numPr>
       </w:pPr>
       <w:r>
@@ -4502,6 +4637,9 @@
     <w:abstractNumId w:val="991"/>
   </w:num>
   <w:num w:numId="1008">
+    <w:abstractNumId w:val="991"/>
+  </w:num>
+  <w:num w:numId="1009">
     <w:abstractNumId w:val="99411"/>
     <w:lvlOverride w:ilvl="0">
       <w:startOverride w:val="1"/>
@@ -4531,10 +4669,10 @@
       <w:startOverride w:val="1"/>
     </w:lvlOverride>
   </w:num>
-  <w:num w:numId="1009">
+  <w:num w:numId="1010">
     <w:abstractNumId w:val="991"/>
   </w:num>
-  <w:num w:numId="1010">
+  <w:num w:numId="1011">
     <w:abstractNumId w:val="991"/>
   </w:num>
 </w:numbering>

</xml_diff>